<commit_message>
The final version of the work with corrections and improvements has been added
</commit_message>
<xml_diff>
--- a/reports/Lab2.docx
+++ b/reports/Lab2.docx
@@ -316,17 +316,7 @@
                 <w:sz w:val="28"/>
                 <w:szCs w:val="28"/>
               </w:rPr>
-              <w:t>Выполнил</w:t>
-            </w:r>
-            <w:bookmarkStart w:id="10" w:name="_GoBack"/>
-            <w:bookmarkEnd w:id="10"/>
-            <w:r>
-              <w:rPr>
-                <w:rFonts w:hint="default" w:ascii="Times New Roman" w:hAnsi="Times New Roman" w:eastAsia="Times New Roman" w:cs="Times New Roman"/>
-                <w:sz w:val="28"/>
-                <w:szCs w:val="28"/>
-              </w:rPr>
-              <w:t>:</w:t>
+              <w:t>Выполнил:</w:t>
             </w:r>
           </w:p>
         </w:tc>
@@ -1871,6 +1861,159 @@
     </w:p>
     <w:p>
       <w:pPr>
+        <w:rPr>
+          <w:rFonts w:hint="default" w:cs="Times New Roman"/>
+          <w:sz w:val="28"/>
+          <w:szCs w:val="28"/>
+          <w:lang w:val="ru-RU"/>
+        </w:rPr>
+      </w:pPr>
+      <w:r>
+        <w:rPr>
+          <w:rFonts w:hint="default" w:cs="Times New Roman"/>
+          <w:sz w:val="28"/>
+          <w:szCs w:val="28"/>
+          <w:lang w:val="ru-RU"/>
+        </w:rPr>
+        <w:t xml:space="preserve">Для создания проекта </w:t>
+      </w:r>
+      <w:r>
+        <w:rPr>
+          <w:rFonts w:hint="default" w:cs="Times New Roman"/>
+          <w:sz w:val="28"/>
+          <w:szCs w:val="28"/>
+          <w:lang w:val="en-US"/>
+        </w:rPr>
+        <w:t xml:space="preserve">helloworld </w:t>
+      </w:r>
+      <w:r>
+        <w:rPr>
+          <w:rFonts w:hint="default" w:cs="Times New Roman"/>
+          <w:sz w:val="28"/>
+          <w:szCs w:val="28"/>
+          <w:lang w:val="ru-RU"/>
+        </w:rPr>
+        <w:t>использовалась команда:</w:t>
+      </w:r>
+    </w:p>
+    <w:p>
+      <w:pPr>
+        <w:spacing w:after="0" w:line="240" w:lineRule="auto"/>
+        <w:rPr>
+          <w:rFonts w:hint="default" w:ascii="Consolas" w:hAnsi="Consolas" w:eastAsia="SimSun" w:cs="Consolas"/>
+          <w:sz w:val="20"/>
+          <w:szCs w:val="20"/>
+        </w:rPr>
+      </w:pPr>
+      <w:r>
+        <w:rPr>
+          <w:rFonts w:hint="default" w:ascii="Consolas" w:hAnsi="Consolas" w:eastAsia="SimSun" w:cs="Consolas"/>
+          <w:sz w:val="20"/>
+          <w:szCs w:val="20"/>
+        </w:rPr>
+        <w:t>django-admin startproject helloworld</w:t>
+      </w:r>
+    </w:p>
+    <w:p>
+      <w:pPr>
+        <w:spacing w:after="0" w:line="240" w:lineRule="auto"/>
+        <w:rPr>
+          <w:rFonts w:hint="default" w:ascii="Consolas" w:hAnsi="Consolas" w:eastAsia="SimSun" w:cs="Consolas"/>
+          <w:sz w:val="20"/>
+          <w:szCs w:val="20"/>
+        </w:rPr>
+      </w:pPr>
+    </w:p>
+    <w:p>
+      <w:pPr>
+        <w:spacing w:after="0" w:line="240" w:lineRule="auto"/>
+        <w:rPr>
+          <w:rFonts w:hint="default" w:cs="Times New Roman"/>
+          <w:sz w:val="28"/>
+          <w:szCs w:val="28"/>
+          <w:lang w:val="ru-RU"/>
+        </w:rPr>
+      </w:pPr>
+      <w:r>
+        <w:rPr>
+          <w:rFonts w:hint="default" w:ascii="Times New Roman" w:hAnsi="Times New Roman" w:eastAsia="SimSun" w:cs="Times New Roman"/>
+          <w:sz w:val="28"/>
+          <w:szCs w:val="28"/>
+          <w:lang w:val="ru-RU"/>
+        </w:rPr>
+        <w:t>Для</w:t>
+      </w:r>
+      <w:r>
+        <w:rPr>
+          <w:rFonts w:hint="default" w:eastAsia="SimSun" w:cs="Times New Roman"/>
+          <w:sz w:val="28"/>
+          <w:szCs w:val="28"/>
+          <w:lang w:val="ru-RU"/>
+        </w:rPr>
+        <w:t xml:space="preserve"> создания приложения </w:t>
+      </w:r>
+      <w:r>
+        <w:rPr>
+          <w:rFonts w:hint="default" w:ascii="Times New Roman" w:hAnsi="Times New Roman" w:cs="Times New Roman"/>
+          <w:sz w:val="28"/>
+          <w:szCs w:val="28"/>
+        </w:rPr>
+        <w:t>flatpages</w:t>
+      </w:r>
+      <w:r>
+        <w:rPr>
+          <w:rFonts w:hint="default" w:cs="Times New Roman"/>
+          <w:sz w:val="28"/>
+          <w:szCs w:val="28"/>
+          <w:lang w:val="ru-RU"/>
+        </w:rPr>
+        <w:t xml:space="preserve"> использовалась команда (предварительно перешли в папку проекта):</w:t>
+      </w:r>
+    </w:p>
+    <w:p>
+      <w:pPr>
+        <w:spacing w:after="0" w:line="240" w:lineRule="auto"/>
+        <w:rPr>
+          <w:rFonts w:hint="default" w:ascii="Consolas" w:hAnsi="Consolas" w:eastAsia="SimSun" w:cs="Consolas"/>
+          <w:sz w:val="20"/>
+          <w:szCs w:val="20"/>
+          <w:lang w:val="ru-RU"/>
+        </w:rPr>
+      </w:pPr>
+    </w:p>
+    <w:p>
+      <w:pPr>
+        <w:spacing w:after="0" w:line="240" w:lineRule="auto"/>
+        <w:rPr>
+          <w:rFonts w:hint="default" w:ascii="Consolas" w:hAnsi="Consolas" w:eastAsia="SimSun" w:cs="Consolas"/>
+          <w:sz w:val="20"/>
+          <w:szCs w:val="20"/>
+          <w:lang w:val="ru-RU"/>
+        </w:rPr>
+      </w:pPr>
+      <w:r>
+        <w:rPr>
+          <w:rFonts w:hint="default" w:ascii="Consolas" w:hAnsi="Consolas" w:eastAsia="SimSun" w:cs="Consolas"/>
+          <w:sz w:val="20"/>
+          <w:szCs w:val="20"/>
+          <w:lang w:val="ru-RU"/>
+        </w:rPr>
+        <w:t>python manage.py startapp flatpages</w:t>
+      </w:r>
+    </w:p>
+    <w:p>
+      <w:pPr>
+        <w:spacing w:after="0" w:line="240" w:lineRule="auto"/>
+        <w:rPr>
+          <w:rFonts w:hint="default" w:ascii="Consolas" w:hAnsi="Consolas" w:eastAsia="SimSun" w:cs="Consolas"/>
+          <w:sz w:val="20"/>
+          <w:szCs w:val="20"/>
+          <w:lang w:val="en-US"/>
+        </w:rPr>
+      </w:pPr>
+    </w:p>
+    <w:p>
+      <w:pPr>
         <w:spacing w:after="240"/>
         <w:rPr>
           <w:rFonts w:hint="default" w:ascii="Times New Roman" w:hAnsi="Times New Roman" w:cs="Times New Roman"/>
@@ -2470,7 +2613,15 @@
           <w:sz w:val="28"/>
           <w:szCs w:val="28"/>
         </w:rPr>
-        <w:t xml:space="preserve"> — Вывод команды migrate (применение миграций: OK)</w:t>
+        <w:t xml:space="preserve"> — </w:t>
+      </w:r>
+      <w:r>
+        <w:rPr>
+          <w:rFonts w:hint="default" w:ascii="Times New Roman" w:hAnsi="Times New Roman"/>
+          <w:sz w:val="28"/>
+          <w:szCs w:val="28"/>
+        </w:rPr>
+        <w:t>Результат выполнения команды migrate: все миграции уже применены</w:t>
       </w:r>
     </w:p>
     <w:p>
@@ -2665,24 +2816,6 @@
           <w:sz w:val="20"/>
           <w:szCs w:val="20"/>
         </w:rPr>
-        <w:t>from flatpages.views import home</w:t>
-      </w:r>
-    </w:p>
-    <w:p>
-      <w:pPr>
-        <w:pStyle w:val="164"/>
-        <w:rPr>
-          <w:rFonts w:hint="default" w:ascii="Consolas" w:hAnsi="Consolas" w:cs="Consolas"/>
-          <w:sz w:val="20"/>
-          <w:szCs w:val="20"/>
-        </w:rPr>
-      </w:pPr>
-      <w:r>
-        <w:rPr>
-          <w:rFonts w:hint="default" w:ascii="Consolas" w:hAnsi="Consolas" w:cs="Consolas"/>
-          <w:sz w:val="20"/>
-          <w:szCs w:val="20"/>
-        </w:rPr>
         <w:t>from flatpages.views import home, static_page</w:t>
       </w:r>
     </w:p>
@@ -3007,16 +3140,11 @@
         </w:rPr>
       </w:pPr>
       <w:r>
-        <w:rPr>
-          <w:rFonts w:hint="default" w:ascii="Times New Roman" w:hAnsi="Times New Roman" w:cs="Times New Roman"/>
-          <w:sz w:val="28"/>
-          <w:szCs w:val="28"/>
-        </w:rPr>
         <w:drawing>
           <wp:inline distT="0" distB="0" distL="114300" distR="114300">
-            <wp:extent cx="6169660" cy="3782695"/>
-            <wp:effectExtent l="0" t="0" r="2540" b="1905"/>
-            <wp:docPr id="5" name="Изображение 3"/>
+            <wp:extent cx="6169025" cy="3042920"/>
+            <wp:effectExtent l="0" t="0" r="3175" b="5080"/>
+            <wp:docPr id="5" name="Изображение 1"/>
             <wp:cNvGraphicFramePr>
               <a:graphicFrameLocks xmlns:a="http://schemas.openxmlformats.org/drawingml/2006/main" noChangeAspect="1"/>
             </wp:cNvGraphicFramePr>
@@ -3024,7 +3152,7 @@
               <a:graphicData uri="http://schemas.openxmlformats.org/drawingml/2006/picture">
                 <pic:pic xmlns:pic="http://schemas.openxmlformats.org/drawingml/2006/picture">
                   <pic:nvPicPr>
-                    <pic:cNvPr id="5" name="Изображение 3"/>
+                    <pic:cNvPr id="5" name="Изображение 1"/>
                     <pic:cNvPicPr>
                       <a:picLocks noChangeAspect="1"/>
                     </pic:cNvPicPr>
@@ -3038,7 +3166,7 @@
                   <pic:spPr>
                     <a:xfrm>
                       <a:off x="0" y="0"/>
-                      <a:ext cx="6169660" cy="3782695"/>
+                      <a:ext cx="6169025" cy="3042920"/>
                     </a:xfrm>
                     <a:prstGeom prst="rect">
                       <a:avLst/>
@@ -3104,16 +3232,11 @@
         </w:rPr>
       </w:pPr>
       <w:r>
-        <w:rPr>
-          <w:rFonts w:hint="default" w:ascii="Times New Roman" w:hAnsi="Times New Roman" w:cs="Times New Roman"/>
-          <w:sz w:val="28"/>
-          <w:szCs w:val="28"/>
-        </w:rPr>
         <w:drawing>
           <wp:inline distT="0" distB="0" distL="114300" distR="114300">
-            <wp:extent cx="5266690" cy="2603500"/>
-            <wp:effectExtent l="0" t="0" r="3810" b="0"/>
-            <wp:docPr id="6" name="Изображение 5"/>
+            <wp:extent cx="6169025" cy="3033395"/>
+            <wp:effectExtent l="0" t="0" r="3175" b="1905"/>
+            <wp:docPr id="6" name="Изображение 2"/>
             <wp:cNvGraphicFramePr>
               <a:graphicFrameLocks xmlns:a="http://schemas.openxmlformats.org/drawingml/2006/main" noChangeAspect="1"/>
             </wp:cNvGraphicFramePr>
@@ -3121,7 +3244,7 @@
               <a:graphicData uri="http://schemas.openxmlformats.org/drawingml/2006/picture">
                 <pic:pic xmlns:pic="http://schemas.openxmlformats.org/drawingml/2006/picture">
                   <pic:nvPicPr>
-                    <pic:cNvPr id="6" name="Изображение 5"/>
+                    <pic:cNvPr id="6" name="Изображение 2"/>
                     <pic:cNvPicPr>
                       <a:picLocks noChangeAspect="1"/>
                     </pic:cNvPicPr>
@@ -3135,7 +3258,7 @@
                   <pic:spPr>
                     <a:xfrm>
                       <a:off x="0" y="0"/>
-                      <a:ext cx="5266690" cy="2603500"/>
+                      <a:ext cx="6169025" cy="3033395"/>
                     </a:xfrm>
                     <a:prstGeom prst="rect">
                       <a:avLst/>
@@ -3602,6 +3725,7 @@
           <w:rFonts w:hint="default" w:ascii="Consolas" w:hAnsi="Consolas" w:cs="Consolas"/>
           <w:sz w:val="20"/>
           <w:szCs w:val="20"/>
+          <w:lang w:val="en-US"/>
         </w:rPr>
       </w:pPr>
       <w:r>
@@ -3611,24 +3735,6 @@
           <w:szCs w:val="20"/>
         </w:rPr>
         <w:t xml:space="preserve"> &lt;li&gt;Элемент 1;&lt;/li&gt;</w:t>
-      </w:r>
-    </w:p>
-    <w:p>
-      <w:pPr>
-        <w:pStyle w:val="164"/>
-        <w:rPr>
-          <w:rFonts w:hint="default" w:ascii="Consolas" w:hAnsi="Consolas" w:cs="Consolas"/>
-          <w:sz w:val="20"/>
-          <w:szCs w:val="20"/>
-        </w:rPr>
-      </w:pPr>
-      <w:r>
-        <w:rPr>
-          <w:rFonts w:hint="default" w:ascii="Consolas" w:hAnsi="Consolas" w:cs="Consolas"/>
-          <w:sz w:val="20"/>
-          <w:szCs w:val="20"/>
-        </w:rPr>
-        <w:t>19</w:t>
       </w:r>
     </w:p>
     <w:p>
@@ -6010,16 +6116,15 @@
     </w:p>
     <w:p>
       <w:pPr>
-        <w:pStyle w:val="164"/>
-        <w:rPr>
-          <w:rFonts w:hint="default" w:ascii="Consolas" w:hAnsi="Consolas" w:cs="Consolas"/>
-          <w:sz w:val="20"/>
-          <w:szCs w:val="20"/>
-        </w:rPr>
-      </w:pPr>
-      <w:r>
-        <w:rPr>
-          <w:rFonts w:hint="default" w:ascii="Consolas" w:hAnsi="Consolas" w:cs="Consolas"/>
+        <w:rPr>
+          <w:rFonts w:hint="default" w:ascii="Consolas" w:hAnsi="Consolas"/>
+          <w:sz w:val="20"/>
+          <w:szCs w:val="20"/>
+        </w:rPr>
+      </w:pPr>
+      <w:r>
+        <w:rPr>
+          <w:rFonts w:hint="default" w:ascii="Consolas" w:hAnsi="Consolas"/>
           <w:sz w:val="20"/>
           <w:szCs w:val="20"/>
         </w:rPr>
@@ -6028,70 +6133,66 @@
     </w:p>
     <w:p>
       <w:pPr>
-        <w:pStyle w:val="164"/>
-        <w:rPr>
-          <w:rFonts w:hint="default" w:ascii="Consolas" w:hAnsi="Consolas" w:cs="Consolas"/>
-          <w:sz w:val="20"/>
-          <w:szCs w:val="20"/>
-        </w:rPr>
-      </w:pPr>
-      <w:r>
-        <w:rPr>
-          <w:rFonts w:hint="default" w:ascii="Consolas" w:hAnsi="Consolas" w:cs="Consolas"/>
-          <w:sz w:val="20"/>
-          <w:szCs w:val="20"/>
-        </w:rPr>
-        <w:t xml:space="preserve"> background: #1abc9c; </w:t>
-      </w:r>
-    </w:p>
-    <w:p>
-      <w:pPr>
-        <w:pStyle w:val="164"/>
-        <w:rPr>
-          <w:rFonts w:hint="default" w:ascii="Consolas" w:hAnsi="Consolas" w:cs="Consolas"/>
-          <w:sz w:val="20"/>
-          <w:szCs w:val="20"/>
-        </w:rPr>
-      </w:pPr>
-      <w:r>
-        <w:rPr>
-          <w:rFonts w:hint="default" w:ascii="Consolas" w:hAnsi="Consolas" w:cs="Consolas"/>
-          <w:sz w:val="20"/>
-          <w:szCs w:val="20"/>
-        </w:rPr>
-        <w:t xml:space="preserve"> font-family: Tahoma, Arial, sans-serif; </w:t>
-      </w:r>
-    </w:p>
-    <w:p>
-      <w:pPr>
-        <w:pStyle w:val="164"/>
-        <w:rPr>
-          <w:rFonts w:hint="default" w:ascii="Consolas" w:hAnsi="Consolas" w:cs="Consolas"/>
-          <w:sz w:val="20"/>
-          <w:szCs w:val="20"/>
-        </w:rPr>
-      </w:pPr>
-      <w:r>
-        <w:rPr>
-          <w:rFonts w:hint="default" w:ascii="Consolas" w:hAnsi="Consolas" w:cs="Consolas"/>
-          <w:sz w:val="20"/>
-          <w:szCs w:val="20"/>
-        </w:rPr>
-        <w:t xml:space="preserve"> color: #333;</w:t>
-      </w:r>
-    </w:p>
-    <w:p>
-      <w:pPr>
-        <w:pStyle w:val="164"/>
-        <w:rPr>
-          <w:rFonts w:hint="default" w:ascii="Consolas" w:hAnsi="Consolas" w:cs="Consolas"/>
-          <w:sz w:val="20"/>
-          <w:szCs w:val="20"/>
-        </w:rPr>
-      </w:pPr>
-      <w:r>
-        <w:rPr>
-          <w:rFonts w:hint="default" w:ascii="Consolas" w:hAnsi="Consolas" w:cs="Consolas"/>
+        <w:rPr>
+          <w:rFonts w:hint="default" w:ascii="Consolas" w:hAnsi="Consolas"/>
+          <w:sz w:val="20"/>
+          <w:szCs w:val="20"/>
+        </w:rPr>
+      </w:pPr>
+      <w:r>
+        <w:rPr>
+          <w:rFonts w:hint="default" w:ascii="Consolas" w:hAnsi="Consolas"/>
+          <w:sz w:val="20"/>
+          <w:szCs w:val="20"/>
+        </w:rPr>
+        <w:t xml:space="preserve">    background: #1abc9c;</w:t>
+      </w:r>
+    </w:p>
+    <w:p>
+      <w:pPr>
+        <w:rPr>
+          <w:rFonts w:hint="default" w:ascii="Consolas" w:hAnsi="Consolas"/>
+          <w:sz w:val="20"/>
+          <w:szCs w:val="20"/>
+        </w:rPr>
+      </w:pPr>
+      <w:r>
+        <w:rPr>
+          <w:rFonts w:hint="default" w:ascii="Consolas" w:hAnsi="Consolas"/>
+          <w:sz w:val="20"/>
+          <w:szCs w:val="20"/>
+        </w:rPr>
+        <w:t xml:space="preserve">    font-family: Tahoma, Arial, sans-serif;</w:t>
+      </w:r>
+    </w:p>
+    <w:p>
+      <w:pPr>
+        <w:rPr>
+          <w:rFonts w:hint="default" w:ascii="Consolas" w:hAnsi="Consolas"/>
+          <w:sz w:val="20"/>
+          <w:szCs w:val="20"/>
+        </w:rPr>
+      </w:pPr>
+      <w:r>
+        <w:rPr>
+          <w:rFonts w:hint="default" w:ascii="Consolas" w:hAnsi="Consolas"/>
+          <w:sz w:val="20"/>
+          <w:szCs w:val="20"/>
+        </w:rPr>
+        <w:t xml:space="preserve">    color: #333;</w:t>
+      </w:r>
+    </w:p>
+    <w:p>
+      <w:pPr>
+        <w:rPr>
+          <w:rFonts w:hint="default" w:ascii="Consolas" w:hAnsi="Consolas"/>
+          <w:sz w:val="20"/>
+          <w:szCs w:val="20"/>
+        </w:rPr>
+      </w:pPr>
+      <w:r>
+        <w:rPr>
+          <w:rFonts w:hint="default" w:ascii="Consolas" w:hAnsi="Consolas"/>
           <w:sz w:val="20"/>
           <w:szCs w:val="20"/>
         </w:rPr>
@@ -6100,16 +6201,84 @@
     </w:p>
     <w:p>
       <w:pPr>
-        <w:pStyle w:val="164"/>
-        <w:rPr>
-          <w:rFonts w:hint="default" w:ascii="Consolas" w:hAnsi="Consolas" w:cs="Consolas"/>
-          <w:sz w:val="20"/>
-          <w:szCs w:val="20"/>
-        </w:rPr>
-      </w:pPr>
-      <w:r>
-        <w:rPr>
-          <w:rFonts w:hint="default" w:ascii="Consolas" w:hAnsi="Consolas" w:cs="Consolas"/>
+        <w:rPr>
+          <w:rFonts w:hint="default" w:ascii="Consolas" w:hAnsi="Consolas"/>
+          <w:sz w:val="20"/>
+          <w:szCs w:val="20"/>
+        </w:rPr>
+      </w:pPr>
+    </w:p>
+    <w:p>
+      <w:pPr>
+        <w:rPr>
+          <w:rFonts w:hint="default" w:ascii="Consolas" w:hAnsi="Consolas"/>
+          <w:sz w:val="20"/>
+          <w:szCs w:val="20"/>
+        </w:rPr>
+      </w:pPr>
+      <w:r>
+        <w:rPr>
+          <w:rFonts w:hint="default" w:ascii="Consolas" w:hAnsi="Consolas"/>
+          <w:sz w:val="20"/>
+          <w:szCs w:val="20"/>
+        </w:rPr>
+        <w:t>h1 {</w:t>
+      </w:r>
+    </w:p>
+    <w:p>
+      <w:pPr>
+        <w:rPr>
+          <w:rFonts w:hint="default" w:ascii="Consolas" w:hAnsi="Consolas"/>
+          <w:sz w:val="20"/>
+          <w:szCs w:val="20"/>
+        </w:rPr>
+      </w:pPr>
+      <w:r>
+        <w:rPr>
+          <w:rFonts w:hint="default" w:ascii="Consolas" w:hAnsi="Consolas"/>
+          <w:sz w:val="20"/>
+          <w:szCs w:val="20"/>
+        </w:rPr>
+        <w:t xml:space="preserve">    font-family: "Times New Roman", Times, serif;</w:t>
+      </w:r>
+    </w:p>
+    <w:p>
+      <w:pPr>
+        <w:rPr>
+          <w:rFonts w:hint="default" w:ascii="Consolas" w:hAnsi="Consolas"/>
+          <w:sz w:val="20"/>
+          <w:szCs w:val="20"/>
+        </w:rPr>
+      </w:pPr>
+      <w:r>
+        <w:rPr>
+          <w:rFonts w:hint="default" w:ascii="Consolas" w:hAnsi="Consolas"/>
+          <w:sz w:val="20"/>
+          <w:szCs w:val="20"/>
+        </w:rPr>
+        <w:t>}</w:t>
+      </w:r>
+    </w:p>
+    <w:p>
+      <w:pPr>
+        <w:rPr>
+          <w:rFonts w:hint="default" w:ascii="Consolas" w:hAnsi="Consolas"/>
+          <w:sz w:val="20"/>
+          <w:szCs w:val="20"/>
+        </w:rPr>
+      </w:pPr>
+    </w:p>
+    <w:p>
+      <w:pPr>
+        <w:rPr>
+          <w:rFonts w:hint="default" w:ascii="Consolas" w:hAnsi="Consolas"/>
+          <w:sz w:val="20"/>
+          <w:szCs w:val="20"/>
+        </w:rPr>
+      </w:pPr>
+      <w:r>
+        <w:rPr>
+          <w:rFonts w:hint="default" w:ascii="Consolas" w:hAnsi="Consolas"/>
           <w:sz w:val="20"/>
           <w:szCs w:val="20"/>
         </w:rPr>
@@ -6118,34 +6287,49 @@
     </w:p>
     <w:p>
       <w:pPr>
-        <w:pStyle w:val="164"/>
-        <w:rPr>
-          <w:rFonts w:hint="default" w:ascii="Consolas" w:hAnsi="Consolas" w:cs="Consolas"/>
-          <w:sz w:val="20"/>
-          <w:szCs w:val="20"/>
-        </w:rPr>
-      </w:pPr>
-      <w:r>
-        <w:rPr>
-          <w:rFonts w:hint="default" w:ascii="Consolas" w:hAnsi="Consolas" w:cs="Consolas"/>
-          <w:sz w:val="20"/>
-          <w:szCs w:val="20"/>
-        </w:rPr>
-        <w:t xml:space="preserve"> border-collapse: collapse;</w:t>
-      </w:r>
-    </w:p>
-    <w:p>
-      <w:pPr>
-        <w:pStyle w:val="164"/>
-        <w:rPr>
-          <w:rFonts w:hint="default" w:ascii="Consolas" w:hAnsi="Consolas" w:cs="Consolas"/>
-          <w:sz w:val="20"/>
-          <w:szCs w:val="20"/>
-        </w:rPr>
-      </w:pPr>
-      <w:r>
-        <w:rPr>
-          <w:rFonts w:hint="default" w:ascii="Consolas" w:hAnsi="Consolas" w:cs="Consolas"/>
+        <w:rPr>
+          <w:rFonts w:hint="default" w:ascii="Consolas" w:hAnsi="Consolas"/>
+          <w:sz w:val="20"/>
+          <w:szCs w:val="20"/>
+        </w:rPr>
+      </w:pPr>
+      <w:r>
+        <w:rPr>
+          <w:rFonts w:hint="default" w:ascii="Consolas" w:hAnsi="Consolas"/>
+          <w:sz w:val="20"/>
+          <w:szCs w:val="20"/>
+        </w:rPr>
+        <w:t xml:space="preserve">    border-collapse: collapse;</w:t>
+      </w:r>
+    </w:p>
+    <w:p>
+      <w:pPr>
+        <w:rPr>
+          <w:rFonts w:hint="default" w:ascii="Consolas" w:hAnsi="Consolas"/>
+          <w:sz w:val="20"/>
+          <w:szCs w:val="20"/>
+        </w:rPr>
+      </w:pPr>
+      <w:r>
+        <w:rPr>
+          <w:rFonts w:hint="default" w:ascii="Consolas" w:hAnsi="Consolas"/>
+          <w:sz w:val="20"/>
+          <w:szCs w:val="20"/>
+        </w:rPr>
+        <w:t xml:space="preserve">    width: 100%;</w:t>
+      </w:r>
+    </w:p>
+    <w:p>
+      <w:pPr>
+        <w:rPr>
+          <w:rFonts w:hint="default" w:ascii="Consolas" w:hAnsi="Consolas"/>
+          <w:sz w:val="20"/>
+          <w:szCs w:val="20"/>
+        </w:rPr>
+      </w:pPr>
+      <w:r>
+        <w:rPr>
+          <w:rFonts w:hint="default" w:ascii="Consolas" w:hAnsi="Consolas"/>
           <w:sz w:val="20"/>
           <w:szCs w:val="20"/>
         </w:rPr>
@@ -6154,70 +6338,92 @@
     </w:p>
     <w:p>
       <w:pPr>
-        <w:pStyle w:val="164"/>
-        <w:rPr>
-          <w:rFonts w:hint="default" w:ascii="Consolas" w:hAnsi="Consolas" w:cs="Consolas"/>
-          <w:sz w:val="20"/>
-          <w:szCs w:val="20"/>
-        </w:rPr>
-      </w:pPr>
-      <w:r>
-        <w:rPr>
-          <w:rFonts w:hint="default" w:ascii="Consolas" w:hAnsi="Consolas" w:cs="Consolas"/>
-          <w:sz w:val="20"/>
-          <w:szCs w:val="20"/>
-        </w:rPr>
-        <w:t>p, h4 {</w:t>
-      </w:r>
-    </w:p>
-    <w:p>
-      <w:pPr>
-        <w:pStyle w:val="164"/>
-        <w:rPr>
-          <w:rFonts w:hint="default" w:ascii="Consolas" w:hAnsi="Consolas" w:cs="Consolas"/>
-          <w:sz w:val="20"/>
-          <w:szCs w:val="20"/>
-        </w:rPr>
-      </w:pPr>
-      <w:r>
-        <w:rPr>
-          <w:rFonts w:hint="default" w:ascii="Consolas" w:hAnsi="Consolas" w:cs="Consolas"/>
-          <w:sz w:val="20"/>
-          <w:szCs w:val="20"/>
-        </w:rPr>
-        <w:t xml:space="preserve"> font-size: 22px; </w:t>
-      </w:r>
-    </w:p>
-    <w:p>
-      <w:pPr>
-        <w:pStyle w:val="164"/>
-        <w:rPr>
-          <w:rFonts w:hint="default" w:ascii="Consolas" w:hAnsi="Consolas" w:cs="Consolas"/>
-          <w:sz w:val="20"/>
-          <w:szCs w:val="20"/>
-        </w:rPr>
-      </w:pPr>
-      <w:r>
-        <w:rPr>
-          <w:rFonts w:hint="default" w:ascii="Consolas" w:hAnsi="Consolas" w:cs="Consolas"/>
-          <w:sz w:val="20"/>
-          <w:szCs w:val="20"/>
-        </w:rPr>
-        <w:t xml:space="preserve"> margin-bottom: 0;</w:t>
-      </w:r>
-    </w:p>
-    <w:p>
-      <w:pPr>
-        <w:pStyle w:val="164"/>
-        <w:rPr>
-          <w:rFonts w:hint="default" w:ascii="Consolas" w:hAnsi="Consolas" w:cs="Consolas"/>
-          <w:sz w:val="20"/>
-          <w:szCs w:val="20"/>
-        </w:rPr>
-      </w:pPr>
-      <w:r>
-        <w:rPr>
-          <w:rFonts w:hint="default" w:ascii="Consolas" w:hAnsi="Consolas" w:cs="Consolas"/>
+        <w:rPr>
+          <w:rFonts w:hint="default" w:ascii="Consolas" w:hAnsi="Consolas"/>
+          <w:sz w:val="20"/>
+          <w:szCs w:val="20"/>
+        </w:rPr>
+      </w:pPr>
+    </w:p>
+    <w:p>
+      <w:pPr>
+        <w:rPr>
+          <w:rFonts w:hint="default" w:ascii="Consolas" w:hAnsi="Consolas"/>
+          <w:sz w:val="20"/>
+          <w:szCs w:val="20"/>
+        </w:rPr>
+      </w:pPr>
+      <w:r>
+        <w:rPr>
+          <w:rFonts w:hint="default" w:ascii="Consolas" w:hAnsi="Consolas"/>
+          <w:sz w:val="20"/>
+          <w:szCs w:val="20"/>
+        </w:rPr>
+        <w:t>th, td {</w:t>
+      </w:r>
+    </w:p>
+    <w:p>
+      <w:pPr>
+        <w:rPr>
+          <w:rFonts w:hint="default" w:ascii="Consolas" w:hAnsi="Consolas"/>
+          <w:sz w:val="20"/>
+          <w:szCs w:val="20"/>
+        </w:rPr>
+      </w:pPr>
+      <w:r>
+        <w:rPr>
+          <w:rFonts w:hint="default" w:ascii="Consolas" w:hAnsi="Consolas"/>
+          <w:sz w:val="20"/>
+          <w:szCs w:val="20"/>
+        </w:rPr>
+        <w:t xml:space="preserve">    padding: 5px;</w:t>
+      </w:r>
+    </w:p>
+    <w:p>
+      <w:pPr>
+        <w:rPr>
+          <w:rFonts w:hint="default" w:ascii="Consolas" w:hAnsi="Consolas"/>
+          <w:sz w:val="20"/>
+          <w:szCs w:val="20"/>
+        </w:rPr>
+      </w:pPr>
+      <w:r>
+        <w:rPr>
+          <w:rFonts w:hint="default" w:ascii="Consolas" w:hAnsi="Consolas"/>
+          <w:sz w:val="20"/>
+          <w:szCs w:val="20"/>
+        </w:rPr>
+        <w:t xml:space="preserve">    text-align: left;</w:t>
+      </w:r>
+    </w:p>
+    <w:p>
+      <w:pPr>
+        <w:rPr>
+          <w:rFonts w:hint="default" w:ascii="Consolas" w:hAnsi="Consolas"/>
+          <w:sz w:val="20"/>
+          <w:szCs w:val="20"/>
+        </w:rPr>
+      </w:pPr>
+      <w:r>
+        <w:rPr>
+          <w:rFonts w:hint="default" w:ascii="Consolas" w:hAnsi="Consolas"/>
+          <w:sz w:val="20"/>
+          <w:szCs w:val="20"/>
+        </w:rPr>
+        <w:t xml:space="preserve">    vertical-align: top;</w:t>
+      </w:r>
+    </w:p>
+    <w:p>
+      <w:pPr>
+        <w:rPr>
+          <w:rFonts w:hint="default" w:ascii="Consolas" w:hAnsi="Consolas"/>
+          <w:sz w:val="20"/>
+          <w:szCs w:val="20"/>
+        </w:rPr>
+      </w:pPr>
+      <w:r>
+        <w:rPr>
+          <w:rFonts w:hint="default" w:ascii="Consolas" w:hAnsi="Consolas"/>
           <w:sz w:val="20"/>
           <w:szCs w:val="20"/>
         </w:rPr>
@@ -6226,16 +6432,178 @@
     </w:p>
     <w:p>
       <w:pPr>
-        <w:pStyle w:val="164"/>
-        <w:rPr>
-          <w:rFonts w:hint="default" w:ascii="Consolas" w:hAnsi="Consolas" w:cs="Consolas"/>
-          <w:sz w:val="20"/>
-          <w:szCs w:val="20"/>
-        </w:rPr>
-      </w:pPr>
-      <w:r>
-        <w:rPr>
-          <w:rFonts w:hint="default" w:ascii="Consolas" w:hAnsi="Consolas" w:cs="Consolas"/>
+        <w:rPr>
+          <w:rFonts w:hint="default" w:ascii="Consolas" w:hAnsi="Consolas"/>
+          <w:sz w:val="20"/>
+          <w:szCs w:val="20"/>
+        </w:rPr>
+      </w:pPr>
+    </w:p>
+    <w:p>
+      <w:pPr>
+        <w:rPr>
+          <w:rFonts w:hint="default" w:ascii="Consolas" w:hAnsi="Consolas"/>
+          <w:sz w:val="20"/>
+          <w:szCs w:val="20"/>
+        </w:rPr>
+      </w:pPr>
+      <w:r>
+        <w:rPr>
+          <w:rFonts w:hint="default" w:ascii="Consolas" w:hAnsi="Consolas"/>
+          <w:sz w:val="20"/>
+          <w:szCs w:val="20"/>
+        </w:rPr>
+        <w:t>p {</w:t>
+      </w:r>
+    </w:p>
+    <w:p>
+      <w:pPr>
+        <w:rPr>
+          <w:rFonts w:hint="default" w:ascii="Consolas" w:hAnsi="Consolas"/>
+          <w:sz w:val="20"/>
+          <w:szCs w:val="20"/>
+        </w:rPr>
+      </w:pPr>
+      <w:r>
+        <w:rPr>
+          <w:rFonts w:hint="default" w:ascii="Consolas" w:hAnsi="Consolas"/>
+          <w:sz w:val="20"/>
+          <w:szCs w:val="20"/>
+        </w:rPr>
+        <w:t xml:space="preserve">    font-size: 22px;</w:t>
+      </w:r>
+    </w:p>
+    <w:p>
+      <w:pPr>
+        <w:rPr>
+          <w:rFonts w:hint="default" w:ascii="Consolas" w:hAnsi="Consolas"/>
+          <w:sz w:val="20"/>
+          <w:szCs w:val="20"/>
+        </w:rPr>
+      </w:pPr>
+      <w:r>
+        <w:rPr>
+          <w:rFonts w:hint="default" w:ascii="Consolas" w:hAnsi="Consolas"/>
+          <w:sz w:val="20"/>
+          <w:szCs w:val="20"/>
+        </w:rPr>
+        <w:t xml:space="preserve">    margin-bottom: 0;</w:t>
+      </w:r>
+    </w:p>
+    <w:p>
+      <w:pPr>
+        <w:rPr>
+          <w:rFonts w:hint="default" w:ascii="Consolas" w:hAnsi="Consolas"/>
+          <w:sz w:val="20"/>
+          <w:szCs w:val="20"/>
+        </w:rPr>
+      </w:pPr>
+      <w:r>
+        <w:rPr>
+          <w:rFonts w:hint="default" w:ascii="Consolas" w:hAnsi="Consolas"/>
+          <w:sz w:val="20"/>
+          <w:szCs w:val="20"/>
+        </w:rPr>
+        <w:t>}</w:t>
+      </w:r>
+    </w:p>
+    <w:p>
+      <w:pPr>
+        <w:rPr>
+          <w:rFonts w:hint="default" w:ascii="Consolas" w:hAnsi="Consolas"/>
+          <w:sz w:val="20"/>
+          <w:szCs w:val="20"/>
+        </w:rPr>
+      </w:pPr>
+    </w:p>
+    <w:p>
+      <w:pPr>
+        <w:rPr>
+          <w:rFonts w:hint="default" w:ascii="Consolas" w:hAnsi="Consolas"/>
+          <w:sz w:val="20"/>
+          <w:szCs w:val="20"/>
+        </w:rPr>
+      </w:pPr>
+      <w:r>
+        <w:rPr>
+          <w:rFonts w:hint="default" w:ascii="Consolas" w:hAnsi="Consolas"/>
+          <w:sz w:val="20"/>
+          <w:szCs w:val="20"/>
+        </w:rPr>
+        <w:t>h4 {</w:t>
+      </w:r>
+    </w:p>
+    <w:p>
+      <w:pPr>
+        <w:rPr>
+          <w:rFonts w:hint="default" w:ascii="Consolas" w:hAnsi="Consolas"/>
+          <w:sz w:val="20"/>
+          <w:szCs w:val="20"/>
+        </w:rPr>
+      </w:pPr>
+      <w:r>
+        <w:rPr>
+          <w:rFonts w:hint="default" w:ascii="Consolas" w:hAnsi="Consolas"/>
+          <w:sz w:val="20"/>
+          <w:szCs w:val="20"/>
+        </w:rPr>
+        <w:t xml:space="preserve">    font-size: 14px;</w:t>
+      </w:r>
+    </w:p>
+    <w:p>
+      <w:pPr>
+        <w:rPr>
+          <w:rFonts w:hint="default" w:ascii="Consolas" w:hAnsi="Consolas"/>
+          <w:sz w:val="20"/>
+          <w:szCs w:val="20"/>
+        </w:rPr>
+      </w:pPr>
+      <w:r>
+        <w:rPr>
+          <w:rFonts w:hint="default" w:ascii="Consolas" w:hAnsi="Consolas"/>
+          <w:sz w:val="20"/>
+          <w:szCs w:val="20"/>
+        </w:rPr>
+        <w:t xml:space="preserve">    margin-bottom: 0;</w:t>
+      </w:r>
+    </w:p>
+    <w:p>
+      <w:pPr>
+        <w:rPr>
+          <w:rFonts w:hint="default" w:ascii="Consolas" w:hAnsi="Consolas"/>
+          <w:sz w:val="20"/>
+          <w:szCs w:val="20"/>
+        </w:rPr>
+      </w:pPr>
+      <w:r>
+        <w:rPr>
+          <w:rFonts w:hint="default" w:ascii="Consolas" w:hAnsi="Consolas"/>
+          <w:sz w:val="20"/>
+          <w:szCs w:val="20"/>
+        </w:rPr>
+        <w:t>}</w:t>
+      </w:r>
+    </w:p>
+    <w:p>
+      <w:pPr>
+        <w:rPr>
+          <w:rFonts w:hint="default" w:ascii="Consolas" w:hAnsi="Consolas"/>
+          <w:sz w:val="20"/>
+          <w:szCs w:val="20"/>
+        </w:rPr>
+      </w:pPr>
+    </w:p>
+    <w:p>
+      <w:pPr>
+        <w:rPr>
+          <w:rFonts w:hint="default" w:ascii="Consolas" w:hAnsi="Consolas"/>
+          <w:sz w:val="20"/>
+          <w:szCs w:val="20"/>
+        </w:rPr>
+      </w:pPr>
+      <w:r>
+        <w:rPr>
+          <w:rFonts w:hint="default" w:ascii="Consolas" w:hAnsi="Consolas"/>
           <w:sz w:val="20"/>
           <w:szCs w:val="20"/>
         </w:rPr>
@@ -6244,34 +6612,32 @@
     </w:p>
     <w:p>
       <w:pPr>
-        <w:pStyle w:val="164"/>
-        <w:rPr>
-          <w:rFonts w:hint="default" w:ascii="Consolas" w:hAnsi="Consolas" w:cs="Consolas"/>
-          <w:sz w:val="20"/>
-          <w:szCs w:val="20"/>
-        </w:rPr>
-      </w:pPr>
-      <w:r>
-        <w:rPr>
-          <w:rFonts w:hint="default" w:ascii="Consolas" w:hAnsi="Consolas" w:cs="Consolas"/>
-          <w:sz w:val="20"/>
-          <w:szCs w:val="20"/>
-        </w:rPr>
-        <w:t xml:space="preserve"> margin: 0</w:t>
-      </w:r>
-    </w:p>
-    <w:p>
-      <w:pPr>
-        <w:pStyle w:val="164"/>
-        <w:rPr>
-          <w:rFonts w:hint="default" w:ascii="Consolas" w:hAnsi="Consolas" w:cs="Consolas"/>
-          <w:sz w:val="20"/>
-          <w:szCs w:val="20"/>
-        </w:rPr>
-      </w:pPr>
-      <w:r>
-        <w:rPr>
-          <w:rFonts w:hint="default" w:ascii="Consolas" w:hAnsi="Consolas" w:cs="Consolas"/>
+        <w:rPr>
+          <w:rFonts w:hint="default" w:ascii="Consolas" w:hAnsi="Consolas"/>
+          <w:sz w:val="20"/>
+          <w:szCs w:val="20"/>
+        </w:rPr>
+      </w:pPr>
+      <w:r>
+        <w:rPr>
+          <w:rFonts w:hint="default" w:ascii="Consolas" w:hAnsi="Consolas"/>
+          <w:sz w:val="20"/>
+          <w:szCs w:val="20"/>
+        </w:rPr>
+        <w:t xml:space="preserve">    margin: 0;</w:t>
+      </w:r>
+    </w:p>
+    <w:p>
+      <w:pPr>
+        <w:rPr>
+          <w:rFonts w:hint="default" w:ascii="Consolas" w:hAnsi="Consolas"/>
+          <w:sz w:val="20"/>
+          <w:szCs w:val="20"/>
+        </w:rPr>
+      </w:pPr>
+      <w:r>
+        <w:rPr>
+          <w:rFonts w:hint="default" w:ascii="Consolas" w:hAnsi="Consolas"/>
           <w:sz w:val="20"/>
           <w:szCs w:val="20"/>
         </w:rPr>
@@ -6280,70 +6646,26 @@
     </w:p>
     <w:p>
       <w:pPr>
-        <w:pStyle w:val="164"/>
-        <w:rPr>
-          <w:rFonts w:hint="default" w:ascii="Consolas" w:hAnsi="Consolas" w:cs="Consolas"/>
-          <w:sz w:val="20"/>
-          <w:szCs w:val="20"/>
-        </w:rPr>
-      </w:pPr>
-      <w:r>
-        <w:rPr>
-          <w:rFonts w:hint="default" w:ascii="Consolas" w:hAnsi="Consolas" w:cs="Consolas"/>
-          <w:sz w:val="20"/>
-          <w:szCs w:val="20"/>
-        </w:rPr>
-        <w:t>table tr td {</w:t>
-      </w:r>
-    </w:p>
-    <w:p>
-      <w:pPr>
-        <w:pStyle w:val="164"/>
-        <w:rPr>
-          <w:rFonts w:hint="default" w:ascii="Consolas" w:hAnsi="Consolas" w:cs="Consolas"/>
-          <w:sz w:val="20"/>
-          <w:szCs w:val="20"/>
-        </w:rPr>
-      </w:pPr>
-      <w:r>
-        <w:rPr>
-          <w:rFonts w:hint="default" w:ascii="Consolas" w:hAnsi="Consolas" w:cs="Consolas"/>
-          <w:sz w:val="20"/>
-          <w:szCs w:val="20"/>
-        </w:rPr>
-        <w:t xml:space="preserve"> padding: 5px</w:t>
-      </w:r>
-    </w:p>
-    <w:p>
-      <w:pPr>
-        <w:pStyle w:val="164"/>
-        <w:rPr>
-          <w:rFonts w:hint="default" w:ascii="Consolas" w:hAnsi="Consolas" w:cs="Consolas"/>
-          <w:sz w:val="20"/>
-          <w:szCs w:val="20"/>
-        </w:rPr>
-      </w:pPr>
-      <w:r>
-        <w:rPr>
-          <w:rFonts w:hint="default" w:ascii="Consolas" w:hAnsi="Consolas" w:cs="Consolas"/>
-          <w:sz w:val="20"/>
-          <w:szCs w:val="20"/>
-        </w:rPr>
-        <w:t>}</w:t>
-      </w:r>
-    </w:p>
-    <w:p>
-      <w:pPr>
-        <w:pStyle w:val="164"/>
-        <w:rPr>
-          <w:rFonts w:hint="default" w:ascii="Consolas" w:hAnsi="Consolas" w:cs="Consolas"/>
-          <w:sz w:val="20"/>
-          <w:szCs w:val="20"/>
-        </w:rPr>
-      </w:pPr>
-      <w:r>
-        <w:rPr>
-          <w:rFonts w:hint="default" w:ascii="Consolas" w:hAnsi="Consolas" w:cs="Consolas"/>
+        <w:rPr>
+          <w:rFonts w:hint="default" w:ascii="Consolas" w:hAnsi="Consolas"/>
+          <w:sz w:val="20"/>
+          <w:szCs w:val="20"/>
+        </w:rPr>
+      </w:pPr>
+      <w:bookmarkStart w:id="10" w:name="_GoBack"/>
+      <w:bookmarkEnd w:id="10"/>
+    </w:p>
+    <w:p>
+      <w:pPr>
+        <w:rPr>
+          <w:rFonts w:hint="default" w:ascii="Consolas" w:hAnsi="Consolas"/>
+          <w:sz w:val="20"/>
+          <w:szCs w:val="20"/>
+        </w:rPr>
+      </w:pPr>
+      <w:r>
+        <w:rPr>
+          <w:rFonts w:hint="default" w:ascii="Consolas" w:hAnsi="Consolas"/>
           <w:sz w:val="20"/>
           <w:szCs w:val="20"/>
         </w:rPr>
@@ -6352,56 +6674,36 @@
     </w:p>
     <w:p>
       <w:pPr>
-        <w:pStyle w:val="164"/>
-        <w:rPr>
-          <w:rFonts w:hint="default" w:ascii="Consolas" w:hAnsi="Consolas" w:cs="Consolas"/>
-          <w:sz w:val="20"/>
-          <w:szCs w:val="20"/>
-        </w:rPr>
-      </w:pPr>
-      <w:r>
-        <w:rPr>
-          <w:rFonts w:hint="default" w:ascii="Consolas" w:hAnsi="Consolas" w:cs="Consolas"/>
-          <w:sz w:val="20"/>
-          <w:szCs w:val="20"/>
-        </w:rPr>
-        <w:t xml:space="preserve">  height: 30px;</w:t>
-      </w:r>
-    </w:p>
-    <w:p>
-      <w:pPr>
-        <w:pStyle w:val="164"/>
-        <w:rPr>
-          <w:rFonts w:hint="default" w:ascii="Consolas" w:hAnsi="Consolas" w:cs="Consolas"/>
-          <w:sz w:val="20"/>
-          <w:szCs w:val="20"/>
-        </w:rPr>
-      </w:pPr>
-      <w:r>
-        <w:rPr>
-          <w:rFonts w:hint="default" w:ascii="Consolas" w:hAnsi="Consolas" w:cs="Consolas"/>
-          <w:sz w:val="20"/>
-          <w:szCs w:val="20"/>
-        </w:rPr>
-        <w:t xml:space="preserve">  width: auto;</w:t>
-      </w:r>
-    </w:p>
-    <w:p>
-      <w:pPr>
-        <w:pStyle w:val="164"/>
-        <w:rPr>
-          <w:rFonts w:hint="default" w:ascii="Consolas" w:hAnsi="Consolas" w:cs="Consolas"/>
-          <w:sz w:val="20"/>
-          <w:szCs w:val="20"/>
-        </w:rPr>
-      </w:pPr>
-      <w:r>
-        <w:rPr>
-          <w:rFonts w:hint="default" w:ascii="Consolas" w:hAnsi="Consolas" w:cs="Consolas"/>
-          <w:sz w:val="20"/>
-          <w:szCs w:val="20"/>
-        </w:rPr>
-        <w:t>}</w:t>
+        <w:rPr>
+          <w:rFonts w:hint="default" w:ascii="Consolas" w:hAnsi="Consolas"/>
+          <w:sz w:val="20"/>
+          <w:szCs w:val="20"/>
+        </w:rPr>
+      </w:pPr>
+      <w:r>
+        <w:rPr>
+          <w:rFonts w:hint="default" w:ascii="Consolas" w:hAnsi="Consolas"/>
+          <w:sz w:val="20"/>
+          <w:szCs w:val="20"/>
+        </w:rPr>
+        <w:t xml:space="preserve">    height: 30px;</w:t>
+      </w:r>
+    </w:p>
+    <w:p>
+      <w:pPr>
+        <w:rPr>
+          <w:rFonts w:hint="default" w:ascii="Consolas" w:hAnsi="Consolas"/>
+          <w:sz w:val="20"/>
+          <w:szCs w:val="20"/>
+        </w:rPr>
+      </w:pPr>
+      <w:r>
+        <w:rPr>
+          <w:rFonts w:hint="default" w:ascii="Consolas" w:hAnsi="Consolas"/>
+          <w:sz w:val="20"/>
+          <w:szCs w:val="20"/>
+        </w:rPr>
+        <w:t xml:space="preserve">    width: auto;</w:t>
       </w:r>
     </w:p>
     <w:p>
@@ -6412,6 +6714,14 @@
           <w:szCs w:val="28"/>
         </w:rPr>
       </w:pPr>
+      <w:r>
+        <w:rPr>
+          <w:rFonts w:hint="default" w:ascii="Consolas" w:hAnsi="Consolas"/>
+          <w:sz w:val="20"/>
+          <w:szCs w:val="20"/>
+        </w:rPr>
+        <w:t>}</w:t>
+      </w:r>
     </w:p>
     <w:p>
       <w:pPr>
@@ -6419,19 +6729,15 @@
           <w:rFonts w:hint="default" w:ascii="Times New Roman" w:hAnsi="Times New Roman" w:cs="Times New Roman"/>
           <w:sz w:val="28"/>
           <w:szCs w:val="28"/>
-        </w:rPr>
-      </w:pPr>
-      <w:r>
-        <w:rPr>
-          <w:rFonts w:hint="default" w:ascii="Times New Roman" w:hAnsi="Times New Roman" w:cs="Times New Roman"/>
-          <w:sz w:val="28"/>
-          <w:szCs w:val="28"/>
-        </w:rPr>
+          <w:vertAlign w:val="subscript"/>
+        </w:rPr>
+      </w:pPr>
+      <w:r>
         <w:drawing>
           <wp:inline distT="0" distB="0" distL="114300" distR="114300">
-            <wp:extent cx="6163310" cy="1555115"/>
-            <wp:effectExtent l="0" t="0" r="0" b="0"/>
-            <wp:docPr id="8" name="Изображение 5"/>
+            <wp:extent cx="6169025" cy="3016885"/>
+            <wp:effectExtent l="0" t="0" r="3175" b="12065"/>
+            <wp:docPr id="13" name="Изображение 4"/>
             <wp:cNvGraphicFramePr>
               <a:graphicFrameLocks xmlns:a="http://schemas.openxmlformats.org/drawingml/2006/main" noChangeAspect="1"/>
             </wp:cNvGraphicFramePr>
@@ -6439,14 +6745,13 @@
               <a:graphicData uri="http://schemas.openxmlformats.org/drawingml/2006/picture">
                 <pic:pic xmlns:pic="http://schemas.openxmlformats.org/drawingml/2006/picture">
                   <pic:nvPicPr>
-                    <pic:cNvPr id="8" name="Изображение 5"/>
+                    <pic:cNvPr id="13" name="Изображение 4"/>
                     <pic:cNvPicPr>
                       <a:picLocks noChangeAspect="1"/>
                     </pic:cNvPicPr>
                   </pic:nvPicPr>
                   <pic:blipFill>
                     <a:blip r:embed="rId13"/>
-                    <a:srcRect t="4195" b="50943"/>
                     <a:stretch>
                       <a:fillRect/>
                     </a:stretch>
@@ -6454,7 +6759,7 @@
                   <pic:spPr>
                     <a:xfrm>
                       <a:off x="0" y="0"/>
-                      <a:ext cx="6163310" cy="1555115"/>
+                      <a:ext cx="6169025" cy="3016885"/>
                     </a:xfrm>
                     <a:prstGeom prst="rect">
                       <a:avLst/>
@@ -6531,16 +6836,11 @@
         </w:rPr>
       </w:pPr>
       <w:r>
-        <w:rPr>
-          <w:rFonts w:hint="default" w:ascii="Times New Roman" w:hAnsi="Times New Roman" w:cs="Times New Roman"/>
-          <w:sz w:val="28"/>
-          <w:szCs w:val="28"/>
-        </w:rPr>
         <w:drawing>
           <wp:inline distT="0" distB="0" distL="114300" distR="114300">
-            <wp:extent cx="6163310" cy="2646680"/>
-            <wp:effectExtent l="0" t="0" r="8890" b="7620"/>
-            <wp:docPr id="9" name="Изображение 6"/>
+            <wp:extent cx="6169025" cy="3020060"/>
+            <wp:effectExtent l="0" t="0" r="3175" b="2540"/>
+            <wp:docPr id="11" name="Изображение 2"/>
             <wp:cNvGraphicFramePr>
               <a:graphicFrameLocks xmlns:a="http://schemas.openxmlformats.org/drawingml/2006/main" noChangeAspect="1"/>
             </wp:cNvGraphicFramePr>
@@ -6548,7 +6848,7 @@
               <a:graphicData uri="http://schemas.openxmlformats.org/drawingml/2006/picture">
                 <pic:pic xmlns:pic="http://schemas.openxmlformats.org/drawingml/2006/picture">
                   <pic:nvPicPr>
-                    <pic:cNvPr id="9" name="Изображение 6"/>
+                    <pic:cNvPr id="11" name="Изображение 2"/>
                     <pic:cNvPicPr>
                       <a:picLocks noChangeAspect="1"/>
                     </pic:cNvPicPr>
@@ -6562,7 +6862,7 @@
                   <pic:spPr>
                     <a:xfrm>
                       <a:off x="0" y="0"/>
-                      <a:ext cx="6163310" cy="2646680"/>
+                      <a:ext cx="6169025" cy="3020060"/>
                     </a:xfrm>
                     <a:prstGeom prst="rect">
                       <a:avLst/>
@@ -6586,7 +6886,7 @@
           <w:rFonts w:hint="default" w:ascii="Times New Roman" w:hAnsi="Times New Roman" w:cs="Times New Roman"/>
           <w:sz w:val="28"/>
           <w:szCs w:val="28"/>
-          <w:lang w:val="ru-RU"/>
+          <w:lang w:val="en-US"/>
         </w:rPr>
       </w:pPr>
       <w:r>
@@ -6648,16 +6948,11 @@
         </w:rPr>
       </w:pPr>
       <w:r>
-        <w:rPr>
-          <w:rFonts w:hint="default" w:ascii="Times New Roman" w:hAnsi="Times New Roman" w:cs="Times New Roman"/>
-          <w:sz w:val="28"/>
-          <w:szCs w:val="28"/>
-        </w:rPr>
         <w:drawing>
           <wp:inline distT="0" distB="0" distL="114300" distR="114300">
-            <wp:extent cx="5266690" cy="2563495"/>
-            <wp:effectExtent l="0" t="0" r="3810" b="1905"/>
-            <wp:docPr id="10" name="Изображение 4"/>
+            <wp:extent cx="6169025" cy="3049270"/>
+            <wp:effectExtent l="0" t="0" r="3175" b="11430"/>
+            <wp:docPr id="10" name="Изображение 1"/>
             <wp:cNvGraphicFramePr>
               <a:graphicFrameLocks xmlns:a="http://schemas.openxmlformats.org/drawingml/2006/main" noChangeAspect="1"/>
             </wp:cNvGraphicFramePr>
@@ -6665,14 +6960,13 @@
               <a:graphicData uri="http://schemas.openxmlformats.org/drawingml/2006/picture">
                 <pic:pic xmlns:pic="http://schemas.openxmlformats.org/drawingml/2006/picture">
                   <pic:nvPicPr>
-                    <pic:cNvPr id="10" name="Изображение 4"/>
+                    <pic:cNvPr id="10" name="Изображение 1"/>
                     <pic:cNvPicPr>
                       <a:picLocks noChangeAspect="1"/>
                     </pic:cNvPicPr>
                   </pic:nvPicPr>
                   <pic:blipFill>
                     <a:blip r:embed="rId15"/>
-                    <a:srcRect t="6322" b="7158"/>
                     <a:stretch>
                       <a:fillRect/>
                     </a:stretch>
@@ -6680,7 +6974,7 @@
                   <pic:spPr>
                     <a:xfrm>
                       <a:off x="0" y="0"/>
-                      <a:ext cx="5266690" cy="2563495"/>
+                      <a:ext cx="6169025" cy="3049270"/>
                     </a:xfrm>
                     <a:prstGeom prst="rect">
                       <a:avLst/>

</xml_diff>